<commit_message>
feat: handover-protocol document template (PDF/DOCX, four languages)
The protocol article's checklist becomes a fill-in form: a Polish
binding template (docs/legal-templates/protokol-zdawczo-odbiorczy.md,
built to DOCX+PDF via the existing pandoc/typst pipeline) with
informational ru/uk/en translations, following the same two-banner
disclaimer convention as the lease templates. Meters with serial
numbers and G12 dual readings, room-by-room condition, equipment,
keys, photo annex, defects, and the zużycie-naturalne note (art.
6b-6e) — the document that decides deposit disputes, downloadable.

Wired in like its siblings: 'protokol' DocumentKey, resources grid
(listed first), and the blog CTA block now maps slugs to documents so
the protocol article ends with its own download card. No RU/UA
protocol template existed anywhere in this niche — this is the
cluster's lead magnet.

Co-Authored-By: Claude Fable 5 <noreply@anthropic.com>
</commit_message>
<xml_diff>
--- a/public/documents/cesja-umowy-najmu.docx
+++ b/public/documents/cesja-umowy-najmu.docx
@@ -728,17 +728,7 @@
         <w:t xml:space="preserve"> </w:t>
       </w:r>
       <w:r>
-        <w:t xml:space="preserve">praw lokatorów.</w:t>
-      </w:r>
-      <w:r>
-        <w:t xml:space="preserve"> </w:t>
-      </w:r>
-      <w:r>
-        <w:rPr>
-          <w:i/>
-          <w:iCs/>
-        </w:rPr>
-        <w:t xml:space="preserve">(niepotrzebne skreślić)</w:t>
+        <w:t xml:space="preserve">praw lokatorów. *(niepotrzebne skreślić)*</w:t>
       </w:r>
       <w:r>
         <w:t xml:space="preserve"> </w:t>
@@ -1020,10 +1010,13 @@
           <w:b/>
           <w:bCs/>
         </w:rPr>
-        <w:t xml:space="preserve">nie zawiera / zawiera</w:t>
-      </w:r>
-      <w:r>
-        <w:t xml:space="preserve">* zakazu lub ograniczenia przeniesienia</w:t>
+        <w:t xml:space="preserve">nie zawiera / zawiera*</w:t>
+      </w:r>
+      <w:r>
+        <w:t xml:space="preserve"> </w:t>
+      </w:r>
+      <w:r>
+        <w:t xml:space="preserve">zakazu lub ograniczenia przeniesienia</w:t>
       </w:r>
       <w:r>
         <w:t xml:space="preserve"> </w:t>
@@ -1073,10 +1066,13 @@
           <w:b/>
           <w:bCs/>
         </w:rPr>
-        <w:t xml:space="preserve">nie zalega / zalega</w:t>
-      </w:r>
-      <w:r>
-        <w:t xml:space="preserve">* z płatnościami z tytułu</w:t>
+        <w:t xml:space="preserve">nie zalega / zalega*</w:t>
+      </w:r>
+      <w:r>
+        <w:t xml:space="preserve"> </w:t>
+      </w:r>
+      <w:r>
+        <w:t xml:space="preserve">z płatnościami z tytułu</w:t>
       </w:r>
       <w:r>
         <w:t xml:space="preserve"> </w:t>
@@ -1707,9 +1703,9 @@
         <w:tblLook w:firstRow="1" w:lastRow="0" w:firstColumn="0" w:lastColumn="0" w:noHBand="0" w:noVBand="0" w:val="0020"/>
       </w:tblPr>
       <w:tblGrid>
-        <w:gridCol w:w="2688"/>
-        <w:gridCol w:w="2615"/>
-        <w:gridCol w:w="2615"/>
+        <w:gridCol w:w="2640"/>
+        <w:gridCol w:w="2640"/>
+        <w:gridCol w:w="2640"/>
       </w:tblGrid>
       <w:tr>
         <w:trPr>

</xml_diff>